<commit_message>
Owner's Manual s. 7: eight versions, the true article map, and every questionnaire choice
The review's findings 1 and 2, approved by Adam as drafted. The version grid
now shows all eight forms (the member-managed single-member pair existed
nowhere in it, and the one-owner S cell carried the wrong name). The article
map matches the masters: multi-owner forms run to Article 16, single-owner to
13, article by article — the old text said 'one article shorter' and mapped
10-13 onto 11-14, wrong on both counts. 'The choices you made' now covers the
borrowing limit (no default; every form except the single-owner
member-managed one), spousal tenancy-by-the-entirety holding with its
consensus-voting and last-death TOD rules, and fraction ownership, alongside
the original three. Article rows aligned with the post-5.2 world: the owners
themselves are each series' protected-series managers in the member-managed
forms.
</commit_message>
<xml_diff>
--- a/docs/word/Series LLC Owners Manual - REVISED DRAFT.docx
+++ b/docs/word/Series LLC Owners Manual - REVISED DRAFT.docx
@@ -3784,7 +3784,7 @@
           <w:sz w:val="22"/>
           <w:szCs w:val="22"/>
         </w:rPr>
-        <w:t xml:space="preserve">Your operating agreement comes in one of five versions. Two questions decide which one you have: </w:t>
+        <w:t xml:space="preserve">Your operating agreement comes in one of eight versions. Three questions decide which one you have: </w:t>
       </w:r>
       <w:r>
         <w:rPr>
@@ -3794,6 +3794,23 @@
           <w:szCs w:val="22"/>
         </w:rPr>
         <w:t xml:space="preserve">who manages the company</w:t>
+      </w:r>
+      <w:r>
+        <w:rPr>
+          <w:rFonts w:ascii="Georgia" w:hAnsi="Georgia"/>
+          <w:sz w:val="22"/>
+          <w:szCs w:val="22"/>
+        </w:rPr>
+        <w:t xml:space="preserve">, </w:t>
+      </w:r>
+      <w:r>
+        <w:rPr>
+          <w:rFonts w:ascii="Georgia" w:hAnsi="Georgia"/>
+          <w:b/>
+          <w:sz w:val="22"/>
+          <w:szCs w:val="22"/>
+        </w:rPr>
+        <w:t xml:space="preserve">how many owners it has</w:t>
       </w:r>
       <w:r>
         <w:rPr>
@@ -3883,7 +3900,7 @@
                 <w:sz w:val="20"/>
                 <w:szCs w:val="20"/>
               </w:rPr>
-              <w:t xml:space="preserve">Taxed as a partnership (or, with one owner, disregarded)</w:t>
+              <w:t xml:space="preserve">Standard (disregarded / partnership)</w:t>
             </w:r>
           </w:p>
         </w:tc>
@@ -3942,7 +3959,7 @@
                 <w:sz w:val="20"/>
                 <w:szCs w:val="20"/>
               </w:rPr>
-              <w:t xml:space="preserve">One owner</w:t>
+              <w:t xml:space="preserve">One owner, manager-managed</w:t>
             </w:r>
           </w:p>
         </w:tc>
@@ -3994,7 +4011,7 @@
                 <w:sz w:val="20"/>
                 <w:szCs w:val="20"/>
               </w:rPr>
-              <w:t xml:space="preserve">Manager-Managed, S Corporation</w:t>
+              <w:t xml:space="preserve">Manager-Managed, Single Member, S Corporation</w:t>
             </w:r>
           </w:p>
         </w:tc>
@@ -4026,7 +4043,91 @@
                 <w:sz w:val="20"/>
                 <w:szCs w:val="20"/>
               </w:rPr>
-              <w:t xml:space="preserve">A designated manager runs it</w:t>
+              <w:t xml:space="preserve">One owner, member-managed</w:t>
+            </w:r>
+          </w:p>
+        </w:tc>
+        <w:tc>
+          <w:tcPr>
+            <w:tcW w:w="3120" w:type="dxa"/>
+            <w:tcMar>
+              <w:top w:w="60" w:type="dxa"/>
+              <w:left w:w="108" w:type="dxa"/>
+              <w:bottom w:w="60" w:type="dxa"/>
+              <w:right w:w="108" w:type="dxa"/>
+            </w:tcMar>
+          </w:tcPr>
+          <w:p>
+            <w:pPr>
+              <w:keepLines/>
+              <w:widowControl/>
+              <w:spacing w:before="40" w:after="40"/>
+            </w:pPr>
+            <w:r>
+              <w:rPr>
+                <w:rFonts w:ascii="Georgia" w:hAnsi="Georgia"/>
+                <w:sz w:val="20"/>
+                <w:szCs w:val="20"/>
+              </w:rPr>
+              <w:t xml:space="preserve">Member-Managed, Single Member</w:t>
+            </w:r>
+          </w:p>
+        </w:tc>
+        <w:tc>
+          <w:tcPr>
+            <w:tcW w:w="3120" w:type="dxa"/>
+            <w:tcMar>
+              <w:top w:w="60" w:type="dxa"/>
+              <w:left w:w="108" w:type="dxa"/>
+              <w:bottom w:w="60" w:type="dxa"/>
+              <w:right w:w="108" w:type="dxa"/>
+            </w:tcMar>
+          </w:tcPr>
+          <w:p>
+            <w:pPr>
+              <w:keepLines/>
+              <w:widowControl/>
+              <w:spacing w:before="40" w:after="40"/>
+            </w:pPr>
+            <w:r>
+              <w:rPr>
+                <w:rFonts w:ascii="Georgia" w:hAnsi="Georgia"/>
+                <w:sz w:val="20"/>
+                <w:szCs w:val="20"/>
+              </w:rPr>
+              <w:t xml:space="preserve">Member-Managed, Single Member, S Corporation</w:t>
+            </w:r>
+          </w:p>
+        </w:tc>
+      </w:tr>
+      <w:tr>
+        <w:trPr>
+          <w:cantSplit/>
+        </w:trPr>
+        <w:tc>
+          <w:tcPr>
+            <w:tcW w:w="3120" w:type="dxa"/>
+            <w:tcMar>
+              <w:top w:w="60" w:type="dxa"/>
+              <w:left w:w="108" w:type="dxa"/>
+              <w:bottom w:w="60" w:type="dxa"/>
+              <w:right w:w="108" w:type="dxa"/>
+            </w:tcMar>
+          </w:tcPr>
+          <w:p>
+            <w:pPr>
+              <w:keepLines/>
+              <w:widowControl/>
+              <w:spacing w:before="40" w:after="40"/>
+            </w:pPr>
+            <w:r>
+              <w:rPr>
+                <w:rFonts w:ascii="Georgia" w:hAnsi="Georgia"/>
+                <w:b/>
+                <w:sz w:val="20"/>
+                <w:szCs w:val="20"/>
+              </w:rPr>
+              <w:t xml:space="preserve">Multiple owners, manager-managed</w:t>
             </w:r>
           </w:p>
         </w:tc>
@@ -4110,7 +4211,7 @@
                 <w:sz w:val="20"/>
                 <w:szCs w:val="20"/>
               </w:rPr>
-              <w:t xml:space="preserve">All owners manage together</w:t>
+              <w:t xml:space="preserve">Multiple owners, member-managed</w:t>
             </w:r>
           </w:p>
         </w:tc>
@@ -4193,7 +4294,7 @@
           <w:sz w:val="22"/>
           <w:szCs w:val="22"/>
         </w:rPr>
-        <w:t xml:space="preserve">All five share the same skeleton through Article 9. From there the single-member form runs one article shorter, because it needs no transfer article — so its Articles 10 through 13 are the other forms' Articles 11 through 14. Here is the map, so you know where things live when a bank, title company, or lawyer asks:</w:t>
+        <w:t xml:space="preserve">All eight share the same skeleton through Article 9. From there the multi-owner forms run to Article 16 — transfers (10), the bankruptcy provisions (11), admissions (12), dissociation and deadlock (13), dissolution (14), amendments (15), and miscellaneous (16). The single-owner forms need no transfer, bankruptcy, or deadlock articles, so they run to Article 13: admission of an additional member (10), dissolution (11), amendments (12), and miscellaneous (13). Here is the map, so you know where things live when a bank, title company, or lawyer asks:</w:t>
       </w:r>
     </w:p>
     <w:tbl>
@@ -4442,7 +4543,7 @@
                 <w:sz w:val="20"/>
                 <w:szCs w:val="20"/>
               </w:rPr>
-              <w:t xml:space="preserve">The owners: membership interests as simple percentages, association with series, voting (multi-member), the transfer-on-death designation (Section 23), and — in the multi-member form — the member duties that power the bankruptcy protections</w:t>
+              <w:t xml:space="preserve">The owners: membership interests as simple percentages, the rule that no owner holds any series directly, voting (multi-owner), the transfer-on-death designation (Section 23), and — in the multi-owner forms — the member duties that power the bankruptcy protections</w:t>
             </w:r>
           </w:p>
         </w:tc>
@@ -4534,7 +4635,7 @@
                 <w:sz w:val="20"/>
                 <w:szCs w:val="20"/>
               </w:rPr>
-              <w:t xml:space="preserve"> forms there is no manager at all: the owners run the company by majority of ownership, each series is run by the company acting through its owners, and one owner may be designated </w:t>
+              <w:t xml:space="preserve"> forms there is no manager at all: the owners run the company by majority of ownership and — as s. 605.2107(1)(n) permits — are themselves named each series' protected-series managers (with one owner, that is you), and one owner may be designated </w:t>
             </w:r>
             <w:r>
               <w:rPr>
@@ -4551,24 +4652,7 @@
                 <w:sz w:val="20"/>
                 <w:szCs w:val="20"/>
               </w:rPr>
-              <w:t xml:space="preserve"> to handle filings, records, and returns (a paperwork role, not a decision-making one). In the </w:t>
-            </w:r>
-            <w:r>
-              <w:rPr>
-                <w:rFonts w:ascii="Georgia" w:hAnsi="Georgia"/>
-                <w:b/>
-                <w:sz w:val="20"/>
-                <w:szCs w:val="20"/>
-              </w:rPr>
-              <w:t xml:space="preserve">single-owner member-managed</w:t>
-            </w:r>
-            <w:r>
-              <w:rPr>
-                <w:rFonts w:ascii="Georgia" w:hAnsi="Georgia"/>
-                <w:sz w:val="20"/>
-                <w:szCs w:val="20"/>
-              </w:rPr>
-              <w:t xml:space="preserve"> forms you are named the protected-series manager of each series directly, as s. 605.2107(1)(n) permits. Every multi-owner form lists the big decisions that need an owner vote — including </w:t>
+              <w:t xml:space="preserve"> to handle filings, records, and returns (a paperwork role, not a decision-making one). Every multi-owner form lists the big decisions that need an owner vote — including </w:t>
             </w:r>
             <w:r>
               <w:rPr>
@@ -4652,7 +4736,7 @@
                 <w:sz w:val="20"/>
                 <w:szCs w:val="20"/>
               </w:rPr>
-              <w:t xml:space="preserve"> and recorded), capital accounts, distributions — always </w:t>
+              <w:t xml:space="preserve"> and recorded), capital accounts (contribution records, not capital accounts, in the S corporation forms), distributions — always </w:t>
             </w:r>
             <w:r>
               <w:rPr>
@@ -4853,7 +4937,7 @@
                 <w:sz w:val="20"/>
                 <w:szCs w:val="20"/>
               </w:rPr>
-              <w:t xml:space="preserve">In the single-member form:</w:t>
+              <w:t xml:space="preserve">In the single-owner forms:</w:t>
             </w:r>
             <w:r>
               <w:rPr>
@@ -4861,7 +4945,7 @@
                 <w:sz w:val="20"/>
                 <w:szCs w:val="20"/>
               </w:rPr>
-              <w:t xml:space="preserve"> admission of an additional member. That form has no transfer article, because Chapter 605 already makes a transfer permissible, gives a transferee distributions and nothing else, and binds a transferee who never signs — there was nothing left for the agreement to add</w:t>
+              <w:t xml:space="preserve"> admission of an additional member. Those forms have no transfer article, because Chapter 605 already makes a transfer permissible, gives a transferee distributions and nothing else, and binds a transferee who never signs — there was nothing left for the agreement to add</w:t>
             </w:r>
           </w:p>
         </w:tc>
@@ -4893,7 +4977,7 @@
                 <w:sz w:val="20"/>
                 <w:szCs w:val="20"/>
               </w:rPr>
-              <w:t xml:space="preserve">Article 11 (multi-member)</w:t>
+              <w:t xml:space="preserve">Article 11 (multi-owner)</w:t>
             </w:r>
           </w:p>
         </w:tc>
@@ -4919,7 +5003,7 @@
                 <w:sz w:val="20"/>
                 <w:szCs w:val="20"/>
               </w:rPr>
-              <w:t xml:space="preserve">The executory-contract provisions — bankruptcy armor built on your members' ongoing duties (Section 23). In the single-member form, Article 11 is dissolution and winding up</w:t>
+              <w:t xml:space="preserve">The executory-contract provisions — bankruptcy armor built on your members' ongoing duties (Section 23). In the single-owner forms, Article 11 is dissolution and winding up</w:t>
             </w:r>
           </w:p>
         </w:tc>
@@ -5023,7 +5107,31 @@
           <w:sz w:val="22"/>
           <w:szCs w:val="22"/>
         </w:rPr>
-        <w:t xml:space="preserve">When you completed the questionnaire, you decided three things that appear in your multi-owner agreement. Here is what each one does.</w:t>
+        <w:t xml:space="preserve">When you completed the questionnaire, you decided several things. Here is what each one does.</w:t>
+      </w:r>
+    </w:p>
+    <w:p>
+      <w:pPr>
+        <w:widowControl/>
+        <w:spacing w:after="160"/>
+        <w:jc w:val="both"/>
+      </w:pPr>
+      <w:r>
+        <w:rPr>
+          <w:rFonts w:ascii="Georgia" w:hAnsi="Georgia"/>
+          <w:b/>
+          <w:sz w:val="22"/>
+          <w:szCs w:val="22"/>
+        </w:rPr>
+        <w:t xml:space="preserve">The borrowing limit (§5.4 / §5.5).</w:t>
+      </w:r>
+      <w:r>
+        <w:rPr>
+          <w:rFonts w:ascii="Georgia" w:hAnsi="Georgia"/>
+          <w:sz w:val="22"/>
+          <w:szCs w:val="22"/>
+        </w:rPr>
+        <w:t xml:space="preserve"> Every form except the single-owner member-managed one asks for a dollar figure: above it, no debt may be incurred and no guarantee given for anyone, without the owners' written consent. There is no default — you chose the number, and it is printed in your agreement. Set it where a borrowing would be big enough that you would want to be asked first.</w:t>
       </w:r>
     </w:p>
     <w:p>
@@ -5164,6 +5272,54 @@
           <w:szCs w:val="22"/>
         </w:rPr>
         <w:t xml:space="preserve"> side chooses whether to buy or sell at that price. Naming the price honestly is self-enforcing — too low and you get bought out cheap, too high and you overpay. Two cautions: it favors whoever has more cash, and it prices the company and all of its series as one unit. If ownership is not evenly split, or the owners' finances are badly mismatched, you were better off omitting it.</w:t>
+      </w:r>
+    </w:p>
+    <w:p>
+      <w:pPr>
+        <w:widowControl/>
+        <w:spacing w:after="160"/>
+        <w:jc w:val="both"/>
+      </w:pPr>
+      <w:r>
+        <w:rPr>
+          <w:rFonts w:ascii="Georgia" w:hAnsi="Georgia"/>
+          <w:b/>
+          <w:sz w:val="22"/>
+          <w:szCs w:val="22"/>
+        </w:rPr>
+        <w:t xml:space="preserve">Spouses holding as one (Exhibit A).</w:t>
+      </w:r>
+      <w:r>
+        <w:rPr>
+          <w:rFonts w:ascii="Georgia" w:hAnsi="Georgia"/>
+          <w:sz w:val="22"/>
+          <w:szCs w:val="22"/>
+        </w:rPr>
+        <w:t xml:space="preserve"> In the multi-owner forms, a married couple may hold one combined interest as tenants by the entirety — Florida's strongest form for spouses — or as joint tenants with right of survivorship. The couple votes only by the consensus of both spouses, and a transfer-on-death designation on that interest takes effect at the death of the last surviving spouse.</w:t>
+      </w:r>
+    </w:p>
+    <w:p>
+      <w:pPr>
+        <w:widowControl/>
+        <w:spacing w:after="160"/>
+        <w:jc w:val="both"/>
+      </w:pPr>
+      <w:r>
+        <w:rPr>
+          <w:rFonts w:ascii="Georgia" w:hAnsi="Georgia"/>
+          <w:b/>
+          <w:sz w:val="22"/>
+          <w:szCs w:val="22"/>
+        </w:rPr>
+        <w:t xml:space="preserve">Percentages or fractions (Exhibit A).</w:t>
+      </w:r>
+      <w:r>
+        <w:rPr>
+          <w:rFonts w:ascii="Georgia" w:hAnsi="Georgia"/>
+          <w:sz w:val="22"/>
+          <w:szCs w:val="22"/>
+        </w:rPr>
+        <w:t xml:space="preserve"> Ownership can be stated as percentages or as exact fractions — three equal owners are 1/3 each, which no percentage writes exactly.</w:t>
       </w:r>
     </w:p>
     <w:p>

</xml_diff>

<commit_message>
The manual stops citing our own drafting history against us
Adam's catch, from the Word draft: s. 9's heading told every client that 'our
earlier drafts' did not permit nominee arrangements, and s. 6 warned that 'an
earlier document or guide' saying the consent rule was variable 'was wrong' —
two client-facing admissions that our own documents were once defective,
serving no reader but an adversary. The heading now says what the paragraph
teaches (nominee arrangements are lawful, with one documentation duty); the
parenthetical is deleted, the sentence before it already stating the rule.

P27 recorded in FAILURES.md with mechanism M31: the 18 August review tested
every sentence against the statutes and the masters and none against the
audience, so two sentences that mismatch no artifact survived a review that
flagged a British spelling in the same section.
</commit_message>
<xml_diff>
--- a/docs/word/Series LLC Owners Manual - REVISED DRAFT.docx
+++ b/docs/word/Series LLC Owners Manual - REVISED DRAFT.docx
@@ -3612,7 +3612,7 @@
           <w:sz w:val="22"/>
           <w:szCs w:val="22"/>
         </w:rPr>
-        <w:t xml:space="preserve"> — s. 605.2107 puts it on the list of non-variable provisions. (If an earlier document or guide told you the operating agreement can modify this rule, it was wrong.) In a single-member company this is trivial — your consent is everyone's consent. In a multi-member company, plan for it: one holdout member can block a new series.</w:t>
+        <w:t xml:space="preserve"> — s. 605.2107 puts it on the list of non-variable provisions. In a single-member company this is trivial — your consent is everyone's consent. In a multi-member company, plan for it: one holdout member can block a new series.</w:t>
       </w:r>
     </w:p>
     <w:p>
@@ -5966,7 +5966,7 @@
           <w:sz w:val="22"/>
           <w:szCs w:val="22"/>
         </w:rPr>
-        <w:t xml:space="preserve">What the statute permits that our earlier drafts did not.</w:t>
+        <w:t xml:space="preserve">Nominee arrangements — lawful, with one duty attached.</w:t>
       </w:r>
       <w:r>
         <w:rPr>

</xml_diff>

<commit_message>
The account rule says what it means: at least one per silo, never shared
Adam's catch from the Word draft: 'one account per silo' reads as a cap of
one, when the rule is a floor of one — a series may keep as many accounts as
its business needs; what silos may never do is share one. Section 12 and
Habit 2 both rewritten to say so.
</commit_message>
<xml_diff>
--- a/docs/word/Series LLC Owners Manual - REVISED DRAFT.docx
+++ b/docs/word/Series LLC Owners Manual - REVISED DRAFT.docx
@@ -7474,15 +7474,15 @@
           <w:sz w:val="22"/>
           <w:szCs w:val="22"/>
         </w:rPr>
-        <w:t xml:space="preserve">The rule: every silo with money has its own account.</w:t>
-      </w:r>
-      <w:r>
-        <w:rPr>
-          <w:rFonts w:ascii="Georgia" w:hAnsi="Georgia"/>
-          <w:sz w:val="22"/>
-          <w:szCs w:val="22"/>
-        </w:rPr>
-        <w:t xml:space="preserve"> The company has one; each active series has one. No exceptions for "it's all mine anyway" — commingling is the single most common way owners destroy the horizontal shield (and the vertical one).</w:t>
+        <w:t xml:space="preserve">The rule: every silo that handles money has at least one account of its own.</w:t>
+      </w:r>
+      <w:r>
+        <w:rPr>
+          <w:rFonts w:ascii="Georgia" w:hAnsi="Georgia"/>
+          <w:sz w:val="22"/>
+          <w:szCs w:val="22"/>
+        </w:rPr>
+        <w:t xml:space="preserve"> The company has its own; each active series has its own — more than one where the business calls for it (an operating account and a security-deposit account, say). What no two silos may ever do is share one. No exceptions for "it's all mine anyway" — commingling is the single most common way owners destroy the horizontal shield (and the vertical one).</w:t>
       </w:r>
     </w:p>
     <w:p>
@@ -7978,15 +7978,15 @@
           <w:sz w:val="22"/>
           <w:szCs w:val="22"/>
         </w:rPr>
-        <w:t xml:space="preserve">Habit 2 — One account per silo, no commingling</w:t>
-      </w:r>
-      <w:r>
-        <w:rPr>
-          <w:rFonts w:ascii="Georgia" w:hAnsi="Georgia"/>
-          <w:sz w:val="22"/>
-          <w:szCs w:val="22"/>
-        </w:rPr>
-        <w:t xml:space="preserve"> (Section 12). Nothing in ch. 605 requires it and your agreement does not either — it is evidence, and it is the best evidence there is. Bank statements in the series' name are association records a stranger believes instantly.</w:t>
+        <w:t xml:space="preserve">Habit 2 — Every silo has at least one account of its own, and no commingling</w:t>
+      </w:r>
+      <w:r>
+        <w:rPr>
+          <w:rFonts w:ascii="Georgia" w:hAnsi="Georgia"/>
+          <w:sz w:val="22"/>
+          <w:szCs w:val="22"/>
+        </w:rPr>
+        <w:t xml:space="preserve"> (Section 12). Nothing in ch. 605 requires separate accounts and your agreement does not either — they are evidence, and the best evidence there is. Bank statements in the series' name are association records a stranger believes instantly.</w:t>
       </w:r>
     </w:p>
     <w:p>

</xml_diff>

<commit_message>
EINs: the manual answers the question, the portal teaches it, and no entity buys twice
New subsection at the end of Manual Section 18 — the company needs an
EIN; a series usually does not (bank requirement, employees, W-9s, state
registrations are the limited exceptions); a separate EIN does not mean
a separate tax return, because every series is wholly owned by the
mothership. The portal's EIN dialog now teaches the same thing, and a
target whose EIN is already ordered disappears — enforced again
server-side (ALREADY_ORDERED). Treas. Reg. §301.7701-2(c)(2)(iv)
re-verified at eCFR before shipping.

Co-Authored-By: Claude Fable 5 <noreply@anthropic.com>
</commit_message>
<xml_diff>
--- a/docs/word/Series LLC Owners Manual - REVISED DRAFT.docx
+++ b/docs/word/Series LLC Owners Manual - REVISED DRAFT.docx
@@ -11303,32 +11303,15 @@
           <w:sz w:val="22"/>
           <w:szCs w:val="22"/>
         </w:rPr>
-        <w:t xml:space="preserve">EINs.</w:t>
-      </w:r>
-      <w:r>
-        <w:rPr>
-          <w:rFonts w:ascii="Georgia" w:hAnsi="Georgia"/>
-          <w:sz w:val="22"/>
-          <w:szCs w:val="22"/>
-        </w:rPr>
-        <w:t xml:space="preserve"> The company needs one. Each series may still want its own, and </w:t>
-      </w:r>
-      <w:r>
-        <w:rPr>
-          <w:rFonts w:ascii="Georgia" w:hAnsi="Georgia"/>
-          <w:i/>
-          <w:sz w:val="22"/>
-          <w:szCs w:val="22"/>
-        </w:rPr>
-        <w:t xml:space="preserve">needs</w:t>
-      </w:r>
-      <w:r>
-        <w:rPr>
-          <w:rFonts w:ascii="Georgia" w:hAnsi="Georgia"/>
-          <w:sz w:val="22"/>
-          <w:szCs w:val="22"/>
-        </w:rPr>
-        <w:t xml:space="preserve"> one if it has employees or excise tax duties (Section 16). An EIN per series is free, routine, and makes the banking cleaner. Your CPA or our EIN service can obtain them.</w:t>
+        <w:t xml:space="preserve">Separate books are not optional.</w:t>
+      </w:r>
+      <w:r>
+        <w:rPr>
+          <w:rFonts w:ascii="Georgia" w:hAnsi="Georgia"/>
+          <w:sz w:val="22"/>
+          <w:szCs w:val="22"/>
+        </w:rPr>
+        <w:t xml:space="preserve"> "One tax return" is not "one set of records." The horizontal shield rests entirely on per-series records (Section 14), and disregarded status does nothing for it.</w:t>
       </w:r>
     </w:p>
     <w:p>
@@ -11349,15 +11332,112 @@
           <w:sz w:val="22"/>
           <w:szCs w:val="22"/>
         </w:rPr>
-        <w:t xml:space="preserve">Separate books are not optional.</w:t>
-      </w:r>
-      <w:r>
-        <w:rPr>
-          <w:rFonts w:ascii="Georgia" w:hAnsi="Georgia"/>
-          <w:sz w:val="22"/>
-          <w:szCs w:val="22"/>
-        </w:rPr>
-        <w:t xml:space="preserve"> "One tax return" is not "one set of records." The horizontal shield rests entirely on per-series records (Section 14), and disregarded status does nothing for it.</w:t>
+        <w:t xml:space="preserve">The other taxes do not care about check-the-box.</w:t>
+      </w:r>
+      <w:r>
+        <w:rPr>
+          <w:rFonts w:ascii="Georgia" w:hAnsi="Georgia"/>
+          <w:sz w:val="22"/>
+          <w:szCs w:val="22"/>
+        </w:rPr>
+        <w:t xml:space="preserve"> Documentary stamp tax on deeds and on notes and mortgages (Section 11). Tangible personal property tax — each county assesses business personalty, appliances in rentals included, with a return (Form DR-405) due per property or business by April 1, and an exemption that often covers small holdings. Sales tax, if any series rents commercial space, rents short-term lodging, or sells taxable goods — its own Department of Revenue registration and collections, plus county tourist development taxes on short-term rentals. Employment taxes, in the silo that employs the people. Property taxes, where a transfer can reset assessments or lose exemptions (Section 11's homestead warning again).</w:t>
+      </w:r>
+    </w:p>
+    <w:p>
+      <w:pPr>
+        <w:widowControl/>
+        <w:spacing w:after="160"/>
+        <w:jc w:val="both"/>
+      </w:pPr>
+      <w:r>
+        <w:rPr>
+          <w:rFonts w:ascii="Georgia" w:hAnsi="Georgia"/>
+          <w:sz w:val="22"/>
+          <w:szCs w:val="22"/>
+        </w:rPr>
+        <w:t xml:space="preserve">Each of those obligations belongs to a </w:t>
+      </w:r>
+      <w:r>
+        <w:rPr>
+          <w:rFonts w:ascii="Georgia" w:hAnsi="Georgia"/>
+          <w:b/>
+          <w:sz w:val="22"/>
+          <w:szCs w:val="22"/>
+        </w:rPr>
+        <w:t xml:space="preserve">specific silo</w:t>
+      </w:r>
+      <w:r>
+        <w:rPr>
+          <w:rFonts w:ascii="Georgia" w:hAnsi="Georgia"/>
+          <w:sz w:val="22"/>
+          <w:szCs w:val="22"/>
+        </w:rPr>
+        <w:t xml:space="preserve">, and paying it from that silo's own account is part of the separateness you are proving.</w:t>
+      </w:r>
+    </w:p>
+    <w:p>
+      <w:pPr>
+        <w:keepNext/>
+        <w:widowControl/>
+        <w:spacing w:before="200" w:after="80"/>
+      </w:pPr>
+      <w:r>
+        <w:rPr>
+          <w:rFonts w:ascii="Georgia" w:hAnsi="Georgia"/>
+          <w:b/>
+          <w:sz w:val="24"/>
+          <w:szCs w:val="24"/>
+        </w:rPr>
+        <w:t xml:space="preserve">THE EIN QUESTION — WHO NEEDS ONE, AND WHAT AN EIN DOES NOT MEAN</w:t>
+      </w:r>
+    </w:p>
+    <w:p>
+      <w:pPr>
+        <w:widowControl/>
+        <w:spacing w:after="160"/>
+        <w:jc w:val="both"/>
+      </w:pPr>
+      <w:r>
+        <w:rPr>
+          <w:rFonts w:ascii="Georgia" w:hAnsi="Georgia"/>
+          <w:b/>
+          <w:sz w:val="22"/>
+          <w:szCs w:val="22"/>
+        </w:rPr>
+        <w:t xml:space="preserve">The company needs an EIN.</w:t>
+      </w:r>
+      <w:r>
+        <w:rPr>
+          <w:rFonts w:ascii="Georgia" w:hAnsi="Georgia"/>
+          <w:sz w:val="22"/>
+          <w:szCs w:val="22"/>
+        </w:rPr>
+        <w:t xml:space="preserve"> Its bank requires one for the account, the IRS requires one to process any election, and it is the number the company gives on W-9s so you are not handing out your Social Security number.</w:t>
+      </w:r>
+    </w:p>
+    <w:p>
+      <w:pPr>
+        <w:keepNext/>
+        <w:widowControl/>
+        <w:spacing w:after="160"/>
+        <w:jc w:val="both"/>
+      </w:pPr>
+      <w:r>
+        <w:rPr>
+          <w:rFonts w:ascii="Georgia" w:hAnsi="Georgia"/>
+          <w:b/>
+          <w:sz w:val="22"/>
+          <w:szCs w:val="22"/>
+        </w:rPr>
+        <w:t xml:space="preserve">A protected series usually does not need one.</w:t>
+      </w:r>
+      <w:r>
+        <w:rPr>
+          <w:rFonts w:ascii="Georgia" w:hAnsi="Georgia"/>
+          <w:sz w:val="22"/>
+          <w:szCs w:val="22"/>
+        </w:rPr>
+        <w:t xml:space="preserve"> Every series is wholly owned by the company, so for federal income tax it is disregarded (this Section): the IRS will never ask a series for an income tax return. A series needs — or benefits from — its own EIN only in limited circumstances:</w:t>
       </w:r>
     </w:p>
     <w:p>
@@ -11378,47 +11458,126 @@
           <w:sz w:val="22"/>
           <w:szCs w:val="22"/>
         </w:rPr>
-        <w:t xml:space="preserve">The other taxes do not care about check-the-box.</w:t>
-      </w:r>
-      <w:r>
-        <w:rPr>
-          <w:rFonts w:ascii="Georgia" w:hAnsi="Georgia"/>
-          <w:sz w:val="22"/>
-          <w:szCs w:val="22"/>
-        </w:rPr>
-        <w:t xml:space="preserve"> Documentary stamp tax on deeds and on notes and mortgages (Section 11). Tangible personal property tax — each county assesses business personalty, appliances in rentals included, with a return (Form DR-405) due per property or business by April 1, and an exemption that often covers small holdings. Sales tax, if any series rents commercial space, rents short-term lodging, or sells taxable goods — its own Department of Revenue registration and collections, plus county tourist development taxes on short-term rentals. Employment taxes, in the silo that employs the people. Property taxes, where a transfer can reset assessments or lose exemptions (Section 11's homestead warning again).</w:t>
-      </w:r>
-    </w:p>
-    <w:p>
-      <w:pPr>
-        <w:widowControl/>
-        <w:spacing w:after="160"/>
-        <w:jc w:val="both"/>
-      </w:pPr>
-      <w:r>
-        <w:rPr>
-          <w:rFonts w:ascii="Georgia" w:hAnsi="Georgia"/>
-          <w:sz w:val="22"/>
-          <w:szCs w:val="22"/>
-        </w:rPr>
-        <w:t xml:space="preserve">Each of those obligations belongs to a </w:t>
-      </w:r>
-      <w:r>
-        <w:rPr>
-          <w:rFonts w:ascii="Georgia" w:hAnsi="Georgia"/>
-          <w:b/>
-          <w:sz w:val="22"/>
-          <w:szCs w:val="22"/>
-        </w:rPr>
-        <w:t xml:space="preserve">specific silo</w:t>
-      </w:r>
-      <w:r>
-        <w:rPr>
-          <w:rFonts w:ascii="Georgia" w:hAnsi="Georgia"/>
-          <w:sz w:val="22"/>
-          <w:szCs w:val="22"/>
-        </w:rPr>
-        <w:t xml:space="preserve">, and paying it from that silo's own account is part of the separateness you are proving.</w:t>
+        <w:t xml:space="preserve">Its bank insists.</w:t>
+      </w:r>
+      <w:r>
+        <w:rPr>
+          <w:rFonts w:ascii="Georgia" w:hAnsi="Georgia"/>
+          <w:sz w:val="22"/>
+          <w:szCs w:val="22"/>
+        </w:rPr>
+        <w:t xml:space="preserve"> Most banks require an EIN for an account titled in the series' name. This is the most common reason by far, and it is a banking rule, not a tax rule. Your CPA or our EIN service can obtain one.</w:t>
+      </w:r>
+    </w:p>
+    <w:p>
+      <w:pPr>
+        <w:numPr>
+          <w:ilvl w:val="0"/>
+          <w:numId w:val="1"/>
+        </w:numPr>
+        <w:keepLines/>
+        <w:widowControl/>
+        <w:spacing w:after="80"/>
+        <w:jc w:val="both"/>
+      </w:pPr>
+      <w:r>
+        <w:rPr>
+          <w:rFonts w:ascii="Georgia" w:hAnsi="Georgia"/>
+          <w:b/>
+          <w:sz w:val="22"/>
+          <w:szCs w:val="22"/>
+        </w:rPr>
+        <w:t xml:space="preserve">It has employees.</w:t>
+      </w:r>
+      <w:r>
+        <w:rPr>
+          <w:rFonts w:ascii="Georgia" w:hAnsi="Georgia"/>
+          <w:sz w:val="22"/>
+          <w:szCs w:val="22"/>
+        </w:rPr>
+        <w:t xml:space="preserve"> Disregarded status does not apply to employment taxes (Treas. Reg. §301.7701-2(c)(2)(iv)); a series that pays wages must have its own EIN and file its own employment returns (Section 16).</w:t>
+      </w:r>
+    </w:p>
+    <w:p>
+      <w:pPr>
+        <w:numPr>
+          <w:ilvl w:val="0"/>
+          <w:numId w:val="1"/>
+        </w:numPr>
+        <w:keepLines/>
+        <w:widowControl/>
+        <w:spacing w:after="80"/>
+        <w:jc w:val="both"/>
+      </w:pPr>
+      <w:r>
+        <w:rPr>
+          <w:rFonts w:ascii="Georgia" w:hAnsi="Georgia"/>
+          <w:b/>
+          <w:sz w:val="22"/>
+          <w:szCs w:val="22"/>
+        </w:rPr>
+        <w:t xml:space="preserve">A counterparty demands a taxpayer number for the named entity</w:t>
+      </w:r>
+      <w:r>
+        <w:rPr>
+          <w:rFonts w:ascii="Georgia" w:hAnsi="Georgia"/>
+          <w:sz w:val="22"/>
+          <w:szCs w:val="22"/>
+        </w:rPr>
+        <w:t xml:space="preserve"> — a lender, title company, insurer, or property manager. Giving them the company's EIN for a series' business stitches the two identities together on paper, the opposite of the separateness you are documenting.</w:t>
+      </w:r>
+    </w:p>
+    <w:p>
+      <w:pPr>
+        <w:numPr>
+          <w:ilvl w:val="0"/>
+          <w:numId w:val="1"/>
+        </w:numPr>
+        <w:keepLines/>
+        <w:widowControl/>
+        <w:spacing w:after="80"/>
+        <w:jc w:val="both"/>
+      </w:pPr>
+      <w:r>
+        <w:rPr>
+          <w:rFonts w:ascii="Georgia" w:hAnsi="Georgia"/>
+          <w:b/>
+          <w:sz w:val="22"/>
+          <w:szCs w:val="22"/>
+        </w:rPr>
+        <w:t xml:space="preserve">State registrations,</w:t>
+      </w:r>
+      <w:r>
+        <w:rPr>
+          <w:rFonts w:ascii="Georgia" w:hAnsi="Georgia"/>
+          <w:sz w:val="22"/>
+          <w:szCs w:val="22"/>
+        </w:rPr>
+        <w:t xml:space="preserve"> where a series is the operator — sales tax, tourist development tax, reemployment tax (Section 16).</w:t>
+      </w:r>
+    </w:p>
+    <w:p>
+      <w:pPr>
+        <w:widowControl/>
+        <w:spacing w:after="160"/>
+        <w:jc w:val="both"/>
+      </w:pPr>
+      <w:r>
+        <w:rPr>
+          <w:rFonts w:ascii="Georgia" w:hAnsi="Georgia"/>
+          <w:b/>
+          <w:sz w:val="22"/>
+          <w:szCs w:val="22"/>
+        </w:rPr>
+        <w:t xml:space="preserve">A separate EIN does not mean a separate tax return.</w:t>
+      </w:r>
+      <w:r>
+        <w:rPr>
+          <w:rFonts w:ascii="Georgia" w:hAnsi="Georgia"/>
+          <w:sz w:val="22"/>
+          <w:szCs w:val="22"/>
+        </w:rPr>
+        <w:t xml:space="preserve"> An EIN is an identification number, not a tax status. Because every series is wholly owned by the mothership, the series never file income tax returns of their own — the only income tax return ever filed for the whole structure is the company's (and where the company itself is disregarded to a single owner, Section 16's table shows that lands on your own Form 1040). If you have questions about the technicalities, ask your attorney or accountant.</w:t>
       </w:r>
     </w:p>
     <w:p>

</xml_diff>

<commit_message>
Manual FAQ: never reuse a sold-out series — the silo keeps its liability history
Adam's Q&A, leading with the recommendation. The portal edition
regenerated and republished through the suite run in this commit.

Co-Authored-By: Claude Fable 5 <noreply@anthropic.com>
</commit_message>
<xml_diff>
--- a/docs/word/Series LLC Owners Manual - REVISED DRAFT.docx
+++ b/docs/word/Series LLC Owners Manual - REVISED DRAFT.docx
@@ -16685,6 +16685,64 @@
           <w:sz w:val="22"/>
           <w:szCs w:val="22"/>
         </w:rPr>
+        <w:t xml:space="preserve">I sold the rental property in one of my series. I'm buying a new rental — can I reuse the empty series and title the new property in it?</w:t>
+      </w:r>
+      <w:r>
+        <w:rPr>
+          <w:rFonts w:ascii="Georgia" w:hAnsi="Georgia"/>
+          <w:sz w:val="22"/>
+          <w:szCs w:val="22"/>
+        </w:rPr>
+        <w:t xml:space="preserve"> Don't. Reusing a series is a bad idea, because a series keeps its liability history long after its asset is gone — nothing in Florida law forbids the reuse; the problem is what comes with it. A tenant injured during your years of ownership, a deposit dispute, a contractor's unpaid claim, a buyer alleging the roof was misrepresented or that termite damage was undisclosed — claims like these belong to </w:t>
+      </w:r>
+      <w:r>
+        <w:rPr>
+          <w:rFonts w:ascii="Georgia" w:hAnsi="Georgia"/>
+          <w:i/>
+          <w:sz w:val="22"/>
+          <w:szCs w:val="22"/>
+        </w:rPr>
+        <w:t xml:space="preserve">that series</w:t>
+      </w:r>
+      <w:r>
+        <w:rPr>
+          <w:rFonts w:ascii="Georgia" w:hAnsi="Georgia"/>
+          <w:sz w:val="22"/>
+          <w:szCs w:val="22"/>
+        </w:rPr>
+        <w:t xml:space="preserve">, they can be filed years after the closing, and a judgment on any of them reaches whatever the series owns </w:t>
+      </w:r>
+      <w:r>
+        <w:rPr>
+          <w:rFonts w:ascii="Georgia" w:hAnsi="Georgia"/>
+          <w:b/>
+          <w:sz w:val="22"/>
+          <w:szCs w:val="22"/>
+        </w:rPr>
+        <w:t xml:space="preserve">at the time the creditor enforces</w:t>
+      </w:r>
+      <w:r>
+        <w:rPr>
+          <w:rFonts w:ascii="Georgia" w:hAnsi="Georgia"/>
+          <w:sz w:val="22"/>
+          <w:szCs w:val="22"/>
+        </w:rPr>
+        <w:t xml:space="preserve"> (s. 605.2404 tests association at enforcement, not just when the liability arose). Title the new property into the old series and you have staked your new investment against the old property's unknown past — the clean compartment you paid for is gone exactly where you need it most. A fresh series costs $25 and gives the new property the one thing the structure exists to provide: a silo with no history. The same logic applies to the sale proceeds: don't leave them parked in the old series, where the old property's tail can reach them — distribute them up to the company, documented, and fund the new purchase into the new series as a recorded contribution (Section 10). Keep the old series alive and empty until you and your advisor are satisfied its exposure has passed, then dissolve it (Section 26) — and never reuse its name or ledger (the same rule Section 26 already gives you).</w:t>
+      </w:r>
+    </w:p>
+    <w:p>
+      <w:pPr>
+        <w:widowControl/>
+        <w:spacing w:after="160"/>
+        <w:jc w:val="both"/>
+      </w:pPr>
+      <w:r>
+        <w:rPr>
+          <w:rFonts w:ascii="Georgia" w:hAnsi="Georgia"/>
+          <w:b/>
+          <w:sz w:val="22"/>
+          <w:szCs w:val="22"/>
+        </w:rPr>
         <w:t xml:space="preserve">Does each series need its own registered agent?</w:t>
       </w:r>
       <w:r>

</xml_diff>